<commit_message>
docs: rebuild Word SOTA doc with Times New Roman 12pt and 6 columns
</commit_message>
<xml_diff>
--- a/docs/Tabel_State_of_the_Art_10_Artikel.docx
+++ b/docs/Tabel_State_of_the_Art_10_Artikel.docx
@@ -8,6 +8,12 @@
         <w:jc w:val="center"/>
       </w:pPr>
       <w:r>
+        <w:rPr>
+          <w:rFonts w:ascii="Times New Roman" w:hAnsi="Times New Roman"/>
+          <w:b/>
+          <w:color w:val="000000"/>
+          <w:sz w:val="28"/>
+        </w:rPr>
         <w:t>TABEL STATE OF THE ART (SOTA)</w:t>
       </w:r>
     </w:p>
@@ -16,19 +22,18 @@
         <w:jc w:val="center"/>
       </w:pPr>
       <w:r>
-        <w:t>Matriks Tinjauan Pustaka 10 Artikel Penelitian Terakreditasi Lengkap dengan Link Penelusuran Terbuka (Garuda, Neliti, ResearchGate, Scholar)</w:t>
-      </w:r>
-    </w:p>
-    <w:p>
-      <w:r>
         <w:rPr>
+          <w:rFonts w:ascii="Times New Roman" w:hAnsi="Times New Roman"/>
           <w:b/>
+          <w:sz w:val="24"/>
         </w:rPr>
         <w:t xml:space="preserve">Judul Penelitian: </w:t>
       </w:r>
       <w:r>
         <w:rPr>
+          <w:rFonts w:ascii="Times New Roman" w:hAnsi="Times New Roman"/>
           <w:i/>
+          <w:sz w:val="24"/>
         </w:rPr>
         <w:t>Klasifikasi Hasil Pertandingan Lima Liga Top Eropa 2025/2026 Menggunakan Random Forest dengan Optimasi Bayesian</w:t>
       </w:r>
@@ -42,27 +47,26 @@
         <w:tblLook w:firstColumn="1" w:firstRow="1" w:lastColumn="0" w:lastRow="0" w:noHBand="0" w:noVBand="1" w:val="04A0"/>
       </w:tblPr>
       <w:tblGrid>
-        <w:gridCol w:w="1530"/>
-        <w:gridCol w:w="1530"/>
-        <w:gridCol w:w="1530"/>
-        <w:gridCol w:w="1530"/>
-        <w:gridCol w:w="1530"/>
-        <w:gridCol w:w="1530"/>
-        <w:gridCol w:w="1530"/>
-        <w:gridCol w:w="1530"/>
+        <w:gridCol w:w="2040"/>
+        <w:gridCol w:w="2040"/>
+        <w:gridCol w:w="2040"/>
+        <w:gridCol w:w="2040"/>
+        <w:gridCol w:w="2040"/>
+        <w:gridCol w:w="2040"/>
       </w:tblGrid>
       <w:tr>
         <w:tc>
           <w:tcPr>
-            <w:tcW w:type="dxa" w:w="1530"/>
+            <w:tcW w:type="dxa" w:w="2040"/>
             <w:shd w:val="clear" w:color="auto" w:fill="1F4E78"/>
           </w:tcPr>
           <w:p>
             <w:r>
               <w:rPr>
+                <w:rFonts w:ascii="Times New Roman" w:hAnsi="Times New Roman"/>
                 <w:b/>
                 <w:color w:val="FFFFFF"/>
-                <w:sz w:val="17"/>
+                <w:sz w:val="24"/>
               </w:rPr>
               <w:t>No</w:t>
             </w:r>
@@ -70,15 +74,16 @@
         </w:tc>
         <w:tc>
           <w:tcPr>
-            <w:tcW w:type="dxa" w:w="1530"/>
+            <w:tcW w:type="dxa" w:w="2040"/>
             <w:shd w:val="clear" w:color="auto" w:fill="1F4E78"/>
           </w:tcPr>
           <w:p>
             <w:r>
               <w:rPr>
+                <w:rFonts w:ascii="Times New Roman" w:hAnsi="Times New Roman"/>
                 <w:b/>
                 <w:color w:val="FFFFFF"/>
-                <w:sz w:val="17"/>
+                <w:sz w:val="24"/>
               </w:rPr>
               <w:t>Peneliti &amp; Tahun</w:t>
             </w:r>
@@ -86,15 +91,16 @@
         </w:tc>
         <w:tc>
           <w:tcPr>
-            <w:tcW w:type="dxa" w:w="1530"/>
+            <w:tcW w:type="dxa" w:w="2040"/>
             <w:shd w:val="clear" w:color="auto" w:fill="1F4E78"/>
           </w:tcPr>
           <w:p>
             <w:r>
               <w:rPr>
+                <w:rFonts w:ascii="Times New Roman" w:hAnsi="Times New Roman"/>
                 <w:b/>
                 <w:color w:val="FFFFFF"/>
-                <w:sz w:val="17"/>
+                <w:sz w:val="24"/>
               </w:rPr>
               <w:t>Judul Artikel</w:t>
             </w:r>
@@ -102,47 +108,16 @@
         </w:tc>
         <w:tc>
           <w:tcPr>
-            <w:tcW w:type="dxa" w:w="1530"/>
+            <w:tcW w:type="dxa" w:w="2040"/>
             <w:shd w:val="clear" w:color="auto" w:fill="1F4E78"/>
           </w:tcPr>
           <w:p>
             <w:r>
               <w:rPr>
+                <w:rFonts w:ascii="Times New Roman" w:hAnsi="Times New Roman"/>
                 <w:b/>
                 <w:color w:val="FFFFFF"/>
-                <w:sz w:val="17"/>
-              </w:rPr>
-              <w:t>Link Akses Resmi (Live)</w:t>
-            </w:r>
-          </w:p>
-        </w:tc>
-        <w:tc>
-          <w:tcPr>
-            <w:tcW w:type="dxa" w:w="1530"/>
-            <w:shd w:val="clear" w:color="auto" w:fill="1F4E78"/>
-          </w:tcPr>
-          <w:p>
-            <w:r>
-              <w:rPr>
-                <w:b/>
-                <w:color w:val="FFFFFF"/>
-                <w:sz w:val="17"/>
-              </w:rPr>
-              <w:t>Dataset</w:t>
-            </w:r>
-          </w:p>
-        </w:tc>
-        <w:tc>
-          <w:tcPr>
-            <w:tcW w:type="dxa" w:w="1530"/>
-            <w:shd w:val="clear" w:color="auto" w:fill="1F4E78"/>
-          </w:tcPr>
-          <w:p>
-            <w:r>
-              <w:rPr>
-                <w:b/>
-                <w:color w:val="FFFFFF"/>
-                <w:sz w:val="17"/>
+                <w:sz w:val="24"/>
               </w:rPr>
               <w:t>Metode</w:t>
             </w:r>
@@ -150,15 +125,16 @@
         </w:tc>
         <w:tc>
           <w:tcPr>
-            <w:tcW w:type="dxa" w:w="1530"/>
+            <w:tcW w:type="dxa" w:w="2040"/>
             <w:shd w:val="clear" w:color="auto" w:fill="1F4E78"/>
           </w:tcPr>
           <w:p>
             <w:r>
               <w:rPr>
+                <w:rFonts w:ascii="Times New Roman" w:hAnsi="Times New Roman"/>
                 <w:b/>
                 <w:color w:val="FFFFFF"/>
-                <w:sz w:val="17"/>
+                <w:sz w:val="24"/>
               </w:rPr>
               <w:t>Hasil Utama</w:t>
             </w:r>
@@ -166,15 +142,16 @@
         </w:tc>
         <w:tc>
           <w:tcPr>
-            <w:tcW w:type="dxa" w:w="1530"/>
+            <w:tcW w:type="dxa" w:w="2040"/>
             <w:shd w:val="clear" w:color="auto" w:fill="1F4E78"/>
           </w:tcPr>
           <w:p>
             <w:r>
               <w:rPr>
+                <w:rFonts w:ascii="Times New Roman" w:hAnsi="Times New Roman"/>
                 <w:b/>
                 <w:color w:val="FFFFFF"/>
-                <w:sz w:val="17"/>
+                <w:sz w:val="24"/>
               </w:rPr>
               <w:t>Keterbatasan / Gap</w:t>
             </w:r>
@@ -184,12 +161,13 @@
       <w:tr>
         <w:tc>
           <w:tcPr>
-            <w:tcW w:type="dxa" w:w="1530"/>
+            <w:tcW w:type="dxa" w:w="2040"/>
           </w:tcPr>
           <w:p>
             <w:r>
               <w:rPr>
-                <w:sz w:val="16"/>
+                <w:rFonts w:ascii="Times New Roman" w:hAnsi="Times New Roman"/>
+                <w:sz w:val="24"/>
               </w:rPr>
               <w:t>1</w:t>
             </w:r>
@@ -197,12 +175,13 @@
         </w:tc>
         <w:tc>
           <w:tcPr>
-            <w:tcW w:type="dxa" w:w="1530"/>
+            <w:tcW w:type="dxa" w:w="2040"/>
           </w:tcPr>
           <w:p>
             <w:r>
               <w:rPr>
-                <w:sz w:val="16"/>
+                <w:rFonts w:ascii="Times New Roman" w:hAnsi="Times New Roman"/>
+                <w:sz w:val="24"/>
               </w:rPr>
               <w:t>Baboota &amp; Kaur (2021)</w:t>
             </w:r>
@@ -210,12 +189,13 @@
         </w:tc>
         <w:tc>
           <w:tcPr>
-            <w:tcW w:type="dxa" w:w="1530"/>
+            <w:tcW w:type="dxa" w:w="2040"/>
           </w:tcPr>
           <w:p>
             <w:r>
               <w:rPr>
-                <w:sz w:val="16"/>
+                <w:rFonts w:ascii="Times New Roman" w:hAnsi="Times New Roman"/>
+                <w:sz w:val="24"/>
               </w:rPr>
               <w:t>Predicting Football Match Outcomes Using Machine Learning Models</w:t>
             </w:r>
@@ -223,38 +203,13 @@
         </w:tc>
         <w:tc>
           <w:tcPr>
-            <w:tcW w:type="dxa" w:w="1530"/>
+            <w:tcW w:type="dxa" w:w="2040"/>
           </w:tcPr>
           <w:p>
             <w:r>
               <w:rPr>
-                <w:sz w:val="16"/>
-              </w:rPr>
-              <w:t>https://scholar.google.com/scholar?q=Predicting+Football+Match+Outcomes+Using+Machine+Learning+Models</w:t>
-            </w:r>
-          </w:p>
-        </w:tc>
-        <w:tc>
-          <w:tcPr>
-            <w:tcW w:type="dxa" w:w="1530"/>
-          </w:tcPr>
-          <w:p>
-            <w:r>
-              <w:rPr>
-                <w:sz w:val="16"/>
-              </w:rPr>
-              <w:t>Data Pertandingan Liga Eropa</w:t>
-            </w:r>
-          </w:p>
-        </w:tc>
-        <w:tc>
-          <w:tcPr>
-            <w:tcW w:type="dxa" w:w="1530"/>
-          </w:tcPr>
-          <w:p>
-            <w:r>
-              <w:rPr>
-                <w:sz w:val="16"/>
+                <w:rFonts w:ascii="Times New Roman" w:hAnsi="Times New Roman"/>
+                <w:sz w:val="24"/>
               </w:rPr>
               <w:t>Random Forest + Feature Scaling</w:t>
             </w:r>
@@ -262,12 +217,13 @@
         </w:tc>
         <w:tc>
           <w:tcPr>
-            <w:tcW w:type="dxa" w:w="1530"/>
+            <w:tcW w:type="dxa" w:w="2040"/>
           </w:tcPr>
           <w:p>
             <w:r>
               <w:rPr>
-                <w:sz w:val="16"/>
+                <w:rFonts w:ascii="Times New Roman" w:hAnsi="Times New Roman"/>
+                <w:sz w:val="24"/>
               </w:rPr>
               <w:t>Akurasi 67.20%</w:t>
             </w:r>
@@ -275,12 +231,13 @@
         </w:tc>
         <w:tc>
           <w:tcPr>
-            <w:tcW w:type="dxa" w:w="1530"/>
+            <w:tcW w:type="dxa" w:w="2040"/>
           </w:tcPr>
           <w:p>
             <w:r>
               <w:rPr>
-                <w:sz w:val="16"/>
+                <w:rFonts w:ascii="Times New Roman" w:hAnsi="Times New Roman"/>
+                <w:sz w:val="24"/>
               </w:rPr>
               <w:t>Belum menerapkan optimasi hyperparameter Bayesian.</w:t>
             </w:r>
@@ -290,12 +247,13 @@
       <w:tr>
         <w:tc>
           <w:tcPr>
-            <w:tcW w:type="dxa" w:w="1530"/>
+            <w:tcW w:type="dxa" w:w="2040"/>
           </w:tcPr>
           <w:p>
             <w:r>
               <w:rPr>
-                <w:sz w:val="16"/>
+                <w:rFonts w:ascii="Times New Roman" w:hAnsi="Times New Roman"/>
+                <w:sz w:val="24"/>
               </w:rPr>
               <w:t>2</w:t>
             </w:r>
@@ -303,12 +261,13 @@
         </w:tc>
         <w:tc>
           <w:tcPr>
-            <w:tcW w:type="dxa" w:w="1530"/>
+            <w:tcW w:type="dxa" w:w="2040"/>
           </w:tcPr>
           <w:p>
             <w:r>
               <w:rPr>
-                <w:sz w:val="16"/>
+                <w:rFonts w:ascii="Times New Roman" w:hAnsi="Times New Roman"/>
+                <w:sz w:val="24"/>
               </w:rPr>
               <w:t>Kurniadi &amp; Haryanto (2022)</w:t>
             </w:r>
@@ -316,12 +275,13 @@
         </w:tc>
         <w:tc>
           <w:tcPr>
-            <w:tcW w:type="dxa" w:w="1530"/>
+            <w:tcW w:type="dxa" w:w="2040"/>
           </w:tcPr>
           <w:p>
             <w:r>
               <w:rPr>
-                <w:sz w:val="16"/>
+                <w:rFonts w:ascii="Times New Roman" w:hAnsi="Times New Roman"/>
+                <w:sz w:val="24"/>
               </w:rPr>
               <w:t>Analisis Kinerja Algoritma Naïve Bayes dan Random Forest dalam Memprediksi Hasil Klasemen Premier League</w:t>
             </w:r>
@@ -329,38 +289,13 @@
         </w:tc>
         <w:tc>
           <w:tcPr>
-            <w:tcW w:type="dxa" w:w="1530"/>
+            <w:tcW w:type="dxa" w:w="2040"/>
           </w:tcPr>
           <w:p>
             <w:r>
               <w:rPr>
-                <w:sz w:val="16"/>
-              </w:rPr>
-              <w:t>https://www.researchgate.net/search.Search.html?query=Random+Forest+English+Premier+League</w:t>
-            </w:r>
-          </w:p>
-        </w:tc>
-        <w:tc>
-          <w:tcPr>
-            <w:tcW w:type="dxa" w:w="1530"/>
-          </w:tcPr>
-          <w:p>
-            <w:r>
-              <w:rPr>
-                <w:sz w:val="16"/>
-              </w:rPr>
-              <w:t>Dataset Premier League</w:t>
-            </w:r>
-          </w:p>
-        </w:tc>
-        <w:tc>
-          <w:tcPr>
-            <w:tcW w:type="dxa" w:w="1530"/>
-          </w:tcPr>
-          <w:p>
-            <w:r>
-              <w:rPr>
-                <w:sz w:val="16"/>
+                <w:rFonts w:ascii="Times New Roman" w:hAnsi="Times New Roman"/>
+                <w:sz w:val="24"/>
               </w:rPr>
               <w:t>Random Forest &amp; XGBoost Baseline</w:t>
             </w:r>
@@ -368,12 +303,13 @@
         </w:tc>
         <w:tc>
           <w:tcPr>
-            <w:tcW w:type="dxa" w:w="1530"/>
+            <w:tcW w:type="dxa" w:w="2040"/>
           </w:tcPr>
           <w:p>
             <w:r>
               <w:rPr>
-                <w:sz w:val="16"/>
+                <w:rFonts w:ascii="Times New Roman" w:hAnsi="Times New Roman"/>
+                <w:sz w:val="24"/>
               </w:rPr>
               <w:t>Akurasi RF: 65.40%, XGBoost: 66.80%</w:t>
             </w:r>
@@ -381,12 +317,13 @@
         </w:tc>
         <w:tc>
           <w:tcPr>
-            <w:tcW w:type="dxa" w:w="1530"/>
+            <w:tcW w:type="dxa" w:w="2040"/>
           </w:tcPr>
           <w:p>
             <w:r>
               <w:rPr>
-                <w:sz w:val="16"/>
+                <w:rFonts w:ascii="Times New Roman" w:hAnsi="Times New Roman"/>
+                <w:sz w:val="24"/>
               </w:rPr>
               <w:t>Belum menggunakan metode hyperparameter tuning probabilistik (Optuna/Bayesian).</w:t>
             </w:r>
@@ -396,12 +333,13 @@
       <w:tr>
         <w:tc>
           <w:tcPr>
-            <w:tcW w:type="dxa" w:w="1530"/>
+            <w:tcW w:type="dxa" w:w="2040"/>
           </w:tcPr>
           <w:p>
             <w:r>
               <w:rPr>
-                <w:sz w:val="16"/>
+                <w:rFonts w:ascii="Times New Roman" w:hAnsi="Times New Roman"/>
+                <w:sz w:val="24"/>
               </w:rPr>
               <w:t>3</w:t>
             </w:r>
@@ -409,12 +347,13 @@
         </w:tc>
         <w:tc>
           <w:tcPr>
-            <w:tcW w:type="dxa" w:w="1530"/>
+            <w:tcW w:type="dxa" w:w="2040"/>
           </w:tcPr>
           <w:p>
             <w:r>
               <w:rPr>
-                <w:sz w:val="16"/>
+                <w:rFonts w:ascii="Times New Roman" w:hAnsi="Times New Roman"/>
+                <w:sz w:val="24"/>
               </w:rPr>
               <w:t>Rahman &amp; Wibowo (2024)</w:t>
             </w:r>
@@ -422,12 +361,13 @@
         </w:tc>
         <w:tc>
           <w:tcPr>
-            <w:tcW w:type="dxa" w:w="1530"/>
+            <w:tcW w:type="dxa" w:w="2040"/>
           </w:tcPr>
           <w:p>
             <w:r>
               <w:rPr>
-                <w:sz w:val="16"/>
+                <w:rFonts w:ascii="Times New Roman" w:hAnsi="Times New Roman"/>
+                <w:sz w:val="24"/>
               </w:rPr>
               <w:t>Optimasi Hyperparameter Bayesian pada Algoritma Random Forest untuk Klasifikasi Data Kompleks</w:t>
             </w:r>
@@ -435,38 +375,13 @@
         </w:tc>
         <w:tc>
           <w:tcPr>
-            <w:tcW w:type="dxa" w:w="1530"/>
+            <w:tcW w:type="dxa" w:w="2040"/>
           </w:tcPr>
           <w:p>
             <w:r>
               <w:rPr>
-                <w:sz w:val="16"/>
-              </w:rPr>
-              <w:t>https://www.neliti.com/id/search?q=Random+Forest+pertandingan</w:t>
-            </w:r>
-          </w:p>
-        </w:tc>
-        <w:tc>
-          <w:tcPr>
-            <w:tcW w:type="dxa" w:w="1530"/>
-          </w:tcPr>
-          <w:p>
-            <w:r>
-              <w:rPr>
-                <w:sz w:val="16"/>
-              </w:rPr>
-              <w:t>Public Dataset Tabular Olahraga</w:t>
-            </w:r>
-          </w:p>
-        </w:tc>
-        <w:tc>
-          <w:tcPr>
-            <w:tcW w:type="dxa" w:w="1530"/>
-          </w:tcPr>
-          <w:p>
-            <w:r>
-              <w:rPr>
-                <w:sz w:val="16"/>
+                <w:rFonts w:ascii="Times New Roman" w:hAnsi="Times New Roman"/>
+                <w:sz w:val="24"/>
               </w:rPr>
               <w:t>Random Forest + Bayesian Optimization</w:t>
             </w:r>
@@ -474,12 +389,13 @@
         </w:tc>
         <w:tc>
           <w:tcPr>
-            <w:tcW w:type="dxa" w:w="1530"/>
+            <w:tcW w:type="dxa" w:w="2040"/>
           </w:tcPr>
           <w:p>
             <w:r>
               <w:rPr>
-                <w:sz w:val="16"/>
+                <w:rFonts w:ascii="Times New Roman" w:hAnsi="Times New Roman"/>
+                <w:sz w:val="24"/>
               </w:rPr>
               <w:t>Peningkatan akurasi 4.80% dibanding baseline</w:t>
             </w:r>
@@ -487,12 +403,13 @@
         </w:tc>
         <w:tc>
           <w:tcPr>
-            <w:tcW w:type="dxa" w:w="1530"/>
+            <w:tcW w:type="dxa" w:w="2040"/>
           </w:tcPr>
           <w:p>
             <w:r>
               <w:rPr>
-                <w:sz w:val="16"/>
+                <w:rFonts w:ascii="Times New Roman" w:hAnsi="Times New Roman"/>
+                <w:sz w:val="24"/>
               </w:rPr>
               <w:t>Uji coba terbatas pada dataset berukuran kecil (&lt; 500 sampel).</w:t>
             </w:r>
@@ -502,12 +419,13 @@
       <w:tr>
         <w:tc>
           <w:tcPr>
-            <w:tcW w:type="dxa" w:w="1530"/>
+            <w:tcW w:type="dxa" w:w="2040"/>
           </w:tcPr>
           <w:p>
             <w:r>
               <w:rPr>
-                <w:sz w:val="16"/>
+                <w:rFonts w:ascii="Times New Roman" w:hAnsi="Times New Roman"/>
+                <w:sz w:val="24"/>
               </w:rPr>
               <w:t>4</w:t>
             </w:r>
@@ -515,12 +433,13 @@
         </w:tc>
         <w:tc>
           <w:tcPr>
-            <w:tcW w:type="dxa" w:w="1530"/>
+            <w:tcW w:type="dxa" w:w="2040"/>
           </w:tcPr>
           <w:p>
             <w:r>
               <w:rPr>
-                <w:sz w:val="16"/>
+                <w:rFonts w:ascii="Times New Roman" w:hAnsi="Times New Roman"/>
+                <w:sz w:val="24"/>
               </w:rPr>
               <w:t>Nugroho &amp; Utomo (2023)</w:t>
             </w:r>
@@ -528,12 +447,13 @@
         </w:tc>
         <w:tc>
           <w:tcPr>
-            <w:tcW w:type="dxa" w:w="1530"/>
+            <w:tcW w:type="dxa" w:w="2040"/>
           </w:tcPr>
           <w:p>
             <w:r>
               <w:rPr>
-                <w:sz w:val="16"/>
+                <w:rFonts w:ascii="Times New Roman" w:hAnsi="Times New Roman"/>
+                <w:sz w:val="24"/>
               </w:rPr>
               <w:t>Prediksi Peluang Juara Menggunakan Algoritma Random Forest dan Simulasi Monte Carlo</w:t>
             </w:r>
@@ -541,38 +461,13 @@
         </w:tc>
         <w:tc>
           <w:tcPr>
-            <w:tcW w:type="dxa" w:w="1530"/>
+            <w:tcW w:type="dxa" w:w="2040"/>
           </w:tcPr>
           <w:p>
             <w:r>
               <w:rPr>
-                <w:sz w:val="16"/>
-              </w:rPr>
-              <w:t>https://www.researchgate.net/search.Search.html?query=Prediksi+Peluang+Juara+Menggunakan+Algoritma+Random+Forest</w:t>
-            </w:r>
-          </w:p>
-        </w:tc>
-        <w:tc>
-          <w:tcPr>
-            <w:tcW w:type="dxa" w:w="1530"/>
-          </w:tcPr>
-          <w:p>
-            <w:r>
-              <w:rPr>
-                <w:sz w:val="16"/>
-              </w:rPr>
-              <w:t>Dataset Sepak Bola Internasional</w:t>
-            </w:r>
-          </w:p>
-        </w:tc>
-        <w:tc>
-          <w:tcPr>
-            <w:tcW w:type="dxa" w:w="1530"/>
-          </w:tcPr>
-          <w:p>
-            <w:r>
-              <w:rPr>
-                <w:sz w:val="16"/>
+                <w:rFonts w:ascii="Times New Roman" w:hAnsi="Times New Roman"/>
+                <w:sz w:val="24"/>
               </w:rPr>
               <w:t>Random Forest + Monte Carlo</w:t>
             </w:r>
@@ -580,12 +475,13 @@
         </w:tc>
         <w:tc>
           <w:tcPr>
-            <w:tcW w:type="dxa" w:w="1530"/>
+            <w:tcW w:type="dxa" w:w="2040"/>
           </w:tcPr>
           <w:p>
             <w:r>
               <w:rPr>
-                <w:sz w:val="16"/>
+                <w:rFonts w:ascii="Times New Roman" w:hAnsi="Times New Roman"/>
+                <w:sz w:val="24"/>
               </w:rPr>
               <w:t>Akurasi Random Forest terbaik (66.10%)</w:t>
             </w:r>
@@ -593,12 +489,13 @@
         </w:tc>
         <w:tc>
           <w:tcPr>
-            <w:tcW w:type="dxa" w:w="1530"/>
+            <w:tcW w:type="dxa" w:w="2040"/>
           </w:tcPr>
           <w:p>
             <w:r>
               <w:rPr>
-                <w:sz w:val="16"/>
+                <w:rFonts w:ascii="Times New Roman" w:hAnsi="Times New Roman"/>
+                <w:sz w:val="24"/>
               </w:rPr>
               <w:t>Pencarian hyperparameter menggunakan Grid Search yang membutuhkan waktu komputasi lama.</w:t>
             </w:r>
@@ -608,12 +505,13 @@
       <w:tr>
         <w:tc>
           <w:tcPr>
-            <w:tcW w:type="dxa" w:w="1530"/>
+            <w:tcW w:type="dxa" w:w="2040"/>
           </w:tcPr>
           <w:p>
             <w:r>
               <w:rPr>
-                <w:sz w:val="16"/>
+                <w:rFonts w:ascii="Times New Roman" w:hAnsi="Times New Roman"/>
+                <w:sz w:val="24"/>
               </w:rPr>
               <w:t>5</w:t>
             </w:r>
@@ -621,12 +519,13 @@
         </w:tc>
         <w:tc>
           <w:tcPr>
-            <w:tcW w:type="dxa" w:w="1530"/>
+            <w:tcW w:type="dxa" w:w="2040"/>
           </w:tcPr>
           <w:p>
             <w:r>
               <w:rPr>
-                <w:sz w:val="16"/>
+                <w:rFonts w:ascii="Times New Roman" w:hAnsi="Times New Roman"/>
+                <w:sz w:val="24"/>
               </w:rPr>
               <w:t>Laksana &amp; Arifin (2025)</w:t>
             </w:r>
@@ -634,12 +533,13 @@
         </w:tc>
         <w:tc>
           <w:tcPr>
-            <w:tcW w:type="dxa" w:w="1530"/>
+            <w:tcW w:type="dxa" w:w="2040"/>
           </w:tcPr>
           <w:p>
             <w:r>
               <w:rPr>
-                <w:sz w:val="16"/>
+                <w:rFonts w:ascii="Times New Roman" w:hAnsi="Times New Roman"/>
+                <w:sz w:val="24"/>
               </w:rPr>
               <w:t>Penerapan Optimasi Bayesian Menggunakan Optuna Pada Model Ensemble Learning Untuk Klasifikasi Data Tabular</w:t>
             </w:r>
@@ -647,38 +547,13 @@
         </w:tc>
         <w:tc>
           <w:tcPr>
-            <w:tcW w:type="dxa" w:w="1530"/>
+            <w:tcW w:type="dxa" w:w="2040"/>
           </w:tcPr>
           <w:p>
             <w:r>
               <w:rPr>
-                <w:sz w:val="16"/>
-              </w:rPr>
-              <w:t>https://garuda.kemdikbud.go.id/documents?q=Random+Forest+Klasifikasi</w:t>
-            </w:r>
-          </w:p>
-        </w:tc>
-        <w:tc>
-          <w:tcPr>
-            <w:tcW w:type="dxa" w:w="1530"/>
-          </w:tcPr>
-          <w:p>
-            <w:r>
-              <w:rPr>
-                <w:sz w:val="16"/>
-              </w:rPr>
-              <w:t>Dataset Tabular Olahraga Kompleks</w:t>
-            </w:r>
-          </w:p>
-        </w:tc>
-        <w:tc>
-          <w:tcPr>
-            <w:tcW w:type="dxa" w:w="1530"/>
-          </w:tcPr>
-          <w:p>
-            <w:r>
-              <w:rPr>
-                <w:sz w:val="16"/>
+                <w:rFonts w:ascii="Times New Roman" w:hAnsi="Times New Roman"/>
+                <w:sz w:val="24"/>
               </w:rPr>
               <w:t>Random Forest + Optuna (Bayesian Opt)</w:t>
             </w:r>
@@ -686,12 +561,13 @@
         </w:tc>
         <w:tc>
           <w:tcPr>
-            <w:tcW w:type="dxa" w:w="1530"/>
+            <w:tcW w:type="dxa" w:w="2040"/>
           </w:tcPr>
           <w:p>
             <w:r>
               <w:rPr>
-                <w:sz w:val="16"/>
+                <w:rFonts w:ascii="Times New Roman" w:hAnsi="Times New Roman"/>
+                <w:sz w:val="24"/>
               </w:rPr>
               <w:t>Peningkatan F1-Score sebesar 5.20%</w:t>
             </w:r>
@@ -699,12 +575,13 @@
         </w:tc>
         <w:tc>
           <w:tcPr>
-            <w:tcW w:type="dxa" w:w="1530"/>
+            <w:tcW w:type="dxa" w:w="2040"/>
           </w:tcPr>
           <w:p>
             <w:r>
               <w:rPr>
-                <w:sz w:val="16"/>
+                <w:rFonts w:ascii="Times New Roman" w:hAnsi="Times New Roman"/>
+                <w:sz w:val="24"/>
               </w:rPr>
               <w:t>Dataset yang diuji belum mencakup statistik pertandingan Lima Liga Top Eropa 2025/2026.</w:t>
             </w:r>
@@ -714,12 +591,13 @@
       <w:tr>
         <w:tc>
           <w:tcPr>
-            <w:tcW w:type="dxa" w:w="1530"/>
+            <w:tcW w:type="dxa" w:w="2040"/>
           </w:tcPr>
           <w:p>
             <w:r>
               <w:rPr>
-                <w:sz w:val="16"/>
+                <w:rFonts w:ascii="Times New Roman" w:hAnsi="Times New Roman"/>
+                <w:sz w:val="24"/>
               </w:rPr>
               <w:t>6</w:t>
             </w:r>
@@ -727,12 +605,13 @@
         </w:tc>
         <w:tc>
           <w:tcPr>
-            <w:tcW w:type="dxa" w:w="1530"/>
+            <w:tcW w:type="dxa" w:w="2040"/>
           </w:tcPr>
           <w:p>
             <w:r>
               <w:rPr>
-                <w:sz w:val="16"/>
+                <w:rFonts w:ascii="Times New Roman" w:hAnsi="Times New Roman"/>
+                <w:sz w:val="24"/>
               </w:rPr>
               <w:t>Wijaya &amp; Susanto (2023)</w:t>
             </w:r>
@@ -740,12 +619,13 @@
         </w:tc>
         <w:tc>
           <w:tcPr>
-            <w:tcW w:type="dxa" w:w="1530"/>
+            <w:tcW w:type="dxa" w:w="2040"/>
           </w:tcPr>
           <w:p>
             <w:r>
               <w:rPr>
-                <w:sz w:val="16"/>
+                <w:rFonts w:ascii="Times New Roman" w:hAnsi="Times New Roman"/>
+                <w:sz w:val="24"/>
               </w:rPr>
               <w:t>Optimasi Hyperparameter Grid Search dan Random Search Pada Algoritma Klasifikasi Machine Learning</w:t>
             </w:r>
@@ -753,38 +633,13 @@
         </w:tc>
         <w:tc>
           <w:tcPr>
-            <w:tcW w:type="dxa" w:w="1530"/>
+            <w:tcW w:type="dxa" w:w="2040"/>
           </w:tcPr>
           <w:p>
             <w:r>
               <w:rPr>
-                <w:sz w:val="16"/>
-              </w:rPr>
-              <w:t>https://www.neliti.com/id/search?q=Random+Forest+Klasifikasi</w:t>
-            </w:r>
-          </w:p>
-        </w:tc>
-        <w:tc>
-          <w:tcPr>
-            <w:tcW w:type="dxa" w:w="1530"/>
-          </w:tcPr>
-          <w:p>
-            <w:r>
-              <w:rPr>
-                <w:sz w:val="16"/>
-              </w:rPr>
-              <w:t>Public Dataset Olahraga</w:t>
-            </w:r>
-          </w:p>
-        </w:tc>
-        <w:tc>
-          <w:tcPr>
-            <w:tcW w:type="dxa" w:w="1530"/>
-          </w:tcPr>
-          <w:p>
-            <w:r>
-              <w:rPr>
-                <w:sz w:val="16"/>
+                <w:rFonts w:ascii="Times New Roman" w:hAnsi="Times New Roman"/>
+                <w:sz w:val="24"/>
               </w:rPr>
               <w:t>Random Forest + Grid Search</w:t>
             </w:r>
@@ -792,12 +647,13 @@
         </w:tc>
         <w:tc>
           <w:tcPr>
-            <w:tcW w:type="dxa" w:w="1530"/>
+            <w:tcW w:type="dxa" w:w="2040"/>
           </w:tcPr>
           <w:p>
             <w:r>
               <w:rPr>
-                <w:sz w:val="16"/>
+                <w:rFonts w:ascii="Times New Roman" w:hAnsi="Times New Roman"/>
+                <w:sz w:val="24"/>
               </w:rPr>
               <w:t>Akurasi 68.10%</w:t>
             </w:r>
@@ -805,12 +661,13 @@
         </w:tc>
         <w:tc>
           <w:tcPr>
-            <w:tcW w:type="dxa" w:w="1530"/>
+            <w:tcW w:type="dxa" w:w="2040"/>
           </w:tcPr>
           <w:p>
             <w:r>
               <w:rPr>
-                <w:sz w:val="16"/>
+                <w:rFonts w:ascii="Times New Roman" w:hAnsi="Times New Roman"/>
+                <w:sz w:val="24"/>
               </w:rPr>
               <w:t>Grid search memerlukan waktu eksekusi yang tinggi dibandingkan optimasi berbasis Bayesian.</w:t>
             </w:r>
@@ -820,12 +677,13 @@
       <w:tr>
         <w:tc>
           <w:tcPr>
-            <w:tcW w:type="dxa" w:w="1530"/>
+            <w:tcW w:type="dxa" w:w="2040"/>
           </w:tcPr>
           <w:p>
             <w:r>
               <w:rPr>
-                <w:sz w:val="16"/>
+                <w:rFonts w:ascii="Times New Roman" w:hAnsi="Times New Roman"/>
+                <w:sz w:val="24"/>
               </w:rPr>
               <w:t>7</w:t>
             </w:r>
@@ -833,12 +691,13 @@
         </w:tc>
         <w:tc>
           <w:tcPr>
-            <w:tcW w:type="dxa" w:w="1530"/>
+            <w:tcW w:type="dxa" w:w="2040"/>
           </w:tcPr>
           <w:p>
             <w:r>
               <w:rPr>
-                <w:sz w:val="16"/>
+                <w:rFonts w:ascii="Times New Roman" w:hAnsi="Times New Roman"/>
+                <w:sz w:val="24"/>
               </w:rPr>
               <w:t>Suryana &amp; Hidayat (2021)</w:t>
             </w:r>
@@ -846,12 +705,13 @@
         </w:tc>
         <w:tc>
           <w:tcPr>
-            <w:tcW w:type="dxa" w:w="1530"/>
+            <w:tcW w:type="dxa" w:w="2040"/>
           </w:tcPr>
           <w:p>
             <w:r>
               <w:rPr>
-                <w:sz w:val="16"/>
+                <w:rFonts w:ascii="Times New Roman" w:hAnsi="Times New Roman"/>
+                <w:sz w:val="24"/>
               </w:rPr>
               <w:t>Implementasi Metode Random Forest untuk Prediksi Hasil Pertandingan Sepak Bola Liga Indonesia</w:t>
             </w:r>
@@ -859,38 +719,13 @@
         </w:tc>
         <w:tc>
           <w:tcPr>
-            <w:tcW w:type="dxa" w:w="1530"/>
+            <w:tcW w:type="dxa" w:w="2040"/>
           </w:tcPr>
           <w:p>
             <w:r>
               <w:rPr>
-                <w:sz w:val="16"/>
-              </w:rPr>
-              <w:t>https://scholar.google.com/scholar?q=Implementasi+Metode+Random+Forest+untuk+Prediksi+Hasil+Pertandingan+Sepak+Bola</w:t>
-            </w:r>
-          </w:p>
-        </w:tc>
-        <w:tc>
-          <w:tcPr>
-            <w:tcW w:type="dxa" w:w="1530"/>
-          </w:tcPr>
-          <w:p>
-            <w:r>
-              <w:rPr>
-                <w:sz w:val="16"/>
-              </w:rPr>
-              <w:t>Data Liga 1 Indonesia</w:t>
-            </w:r>
-          </w:p>
-        </w:tc>
-        <w:tc>
-          <w:tcPr>
-            <w:tcW w:type="dxa" w:w="1530"/>
-          </w:tcPr>
-          <w:p>
-            <w:r>
-              <w:rPr>
-                <w:sz w:val="16"/>
+                <w:rFonts w:ascii="Times New Roman" w:hAnsi="Times New Roman"/>
+                <w:sz w:val="24"/>
               </w:rPr>
               <w:t>Random Forest Classifier</w:t>
             </w:r>
@@ -898,12 +733,13 @@
         </w:tc>
         <w:tc>
           <w:tcPr>
-            <w:tcW w:type="dxa" w:w="1530"/>
+            <w:tcW w:type="dxa" w:w="2040"/>
           </w:tcPr>
           <w:p>
             <w:r>
               <w:rPr>
-                <w:sz w:val="16"/>
+                <w:rFonts w:ascii="Times New Roman" w:hAnsi="Times New Roman"/>
+                <w:sz w:val="24"/>
               </w:rPr>
               <w:t>Akurasi 62.80%</w:t>
             </w:r>
@@ -911,12 +747,13 @@
         </w:tc>
         <w:tc>
           <w:tcPr>
-            <w:tcW w:type="dxa" w:w="1530"/>
+            <w:tcW w:type="dxa" w:w="2040"/>
           </w:tcPr>
           <w:p>
             <w:r>
               <w:rPr>
-                <w:sz w:val="16"/>
+                <w:rFonts w:ascii="Times New Roman" w:hAnsi="Times New Roman"/>
+                <w:sz w:val="24"/>
               </w:rPr>
               <w:t>Sampel data terbatas dan tidak mengukur in-match statistics seperti shots on target &amp; fouls.</w:t>
             </w:r>
@@ -926,12 +763,13 @@
       <w:tr>
         <w:tc>
           <w:tcPr>
-            <w:tcW w:type="dxa" w:w="1530"/>
+            <w:tcW w:type="dxa" w:w="2040"/>
           </w:tcPr>
           <w:p>
             <w:r>
               <w:rPr>
-                <w:sz w:val="16"/>
+                <w:rFonts w:ascii="Times New Roman" w:hAnsi="Times New Roman"/>
+                <w:sz w:val="24"/>
               </w:rPr>
               <w:t>8</w:t>
             </w:r>
@@ -939,12 +777,13 @@
         </w:tc>
         <w:tc>
           <w:tcPr>
-            <w:tcW w:type="dxa" w:w="1530"/>
+            <w:tcW w:type="dxa" w:w="2040"/>
           </w:tcPr>
           <w:p>
             <w:r>
               <w:rPr>
-                <w:sz w:val="16"/>
+                <w:rFonts w:ascii="Times New Roman" w:hAnsi="Times New Roman"/>
+                <w:sz w:val="24"/>
               </w:rPr>
               <w:t>Firmansyah &amp; Saputra (2022)</w:t>
             </w:r>
@@ -952,12 +791,13 @@
         </w:tc>
         <w:tc>
           <w:tcPr>
-            <w:tcW w:type="dxa" w:w="1530"/>
+            <w:tcW w:type="dxa" w:w="2040"/>
           </w:tcPr>
           <w:p>
             <w:r>
               <w:rPr>
-                <w:sz w:val="16"/>
+                <w:rFonts w:ascii="Times New Roman" w:hAnsi="Times New Roman"/>
+                <w:sz w:val="24"/>
               </w:rPr>
               <w:t>Prediksi Kemenangan Pertandingan Sepak Bola Berdasarkan Statistik Pertandingan Menggunakan SVM dan Random Forest</w:t>
             </w:r>
@@ -965,38 +805,13 @@
         </w:tc>
         <w:tc>
           <w:tcPr>
-            <w:tcW w:type="dxa" w:w="1530"/>
+            <w:tcW w:type="dxa" w:w="2040"/>
           </w:tcPr>
           <w:p>
             <w:r>
               <w:rPr>
-                <w:sz w:val="16"/>
-              </w:rPr>
-              <w:t>https://www.semanticscholar.org/search?q=Random%20Forest%20Soccer%20Prediction</w:t>
-            </w:r>
-          </w:p>
-        </w:tc>
-        <w:tc>
-          <w:tcPr>
-            <w:tcW w:type="dxa" w:w="1530"/>
-          </w:tcPr>
-          <w:p>
-            <w:r>
-              <w:rPr>
-                <w:sz w:val="16"/>
-              </w:rPr>
-              <w:t>Dataset Liga Spanyol (La Liga)</w:t>
-            </w:r>
-          </w:p>
-        </w:tc>
-        <w:tc>
-          <w:tcPr>
-            <w:tcW w:type="dxa" w:w="1530"/>
-          </w:tcPr>
-          <w:p>
-            <w:r>
-              <w:rPr>
-                <w:sz w:val="16"/>
+                <w:rFonts w:ascii="Times New Roman" w:hAnsi="Times New Roman"/>
+                <w:sz w:val="24"/>
               </w:rPr>
               <w:t>SVM &amp; Random Forest</w:t>
             </w:r>
@@ -1004,12 +819,13 @@
         </w:tc>
         <w:tc>
           <w:tcPr>
-            <w:tcW w:type="dxa" w:w="1530"/>
+            <w:tcW w:type="dxa" w:w="2040"/>
           </w:tcPr>
           <w:p>
             <w:r>
               <w:rPr>
-                <w:sz w:val="16"/>
+                <w:rFonts w:ascii="Times New Roman" w:hAnsi="Times New Roman"/>
+                <w:sz w:val="24"/>
               </w:rPr>
               <w:t>Akurasi Random Forest 64.50%</w:t>
             </w:r>
@@ -1017,12 +833,13 @@
         </w:tc>
         <w:tc>
           <w:tcPr>
-            <w:tcW w:type="dxa" w:w="1530"/>
+            <w:tcW w:type="dxa" w:w="2040"/>
           </w:tcPr>
           <w:p>
             <w:r>
               <w:rPr>
-                <w:sz w:val="16"/>
+                <w:rFonts w:ascii="Times New Roman" w:hAnsi="Times New Roman"/>
+                <w:sz w:val="24"/>
               </w:rPr>
               <w:t>Tidak melakukan tuning parameter secara otomatis.</w:t>
             </w:r>
@@ -1032,12 +849,13 @@
       <w:tr>
         <w:tc>
           <w:tcPr>
-            <w:tcW w:type="dxa" w:w="1530"/>
+            <w:tcW w:type="dxa" w:w="2040"/>
           </w:tcPr>
           <w:p>
             <w:r>
               <w:rPr>
-                <w:sz w:val="16"/>
+                <w:rFonts w:ascii="Times New Roman" w:hAnsi="Times New Roman"/>
+                <w:sz w:val="24"/>
               </w:rPr>
               <w:t>9</w:t>
             </w:r>
@@ -1045,12 +863,13 @@
         </w:tc>
         <w:tc>
           <w:tcPr>
-            <w:tcW w:type="dxa" w:w="1530"/>
+            <w:tcW w:type="dxa" w:w="2040"/>
           </w:tcPr>
           <w:p>
             <w:r>
               <w:rPr>
-                <w:sz w:val="16"/>
+                <w:rFonts w:ascii="Times New Roman" w:hAnsi="Times New Roman"/>
+                <w:sz w:val="24"/>
               </w:rPr>
               <w:t>Azhari &amp; Ramadhan (2024)</w:t>
             </w:r>
@@ -1058,12 +877,13 @@
         </w:tc>
         <w:tc>
           <w:tcPr>
-            <w:tcW w:type="dxa" w:w="1530"/>
+            <w:tcW w:type="dxa" w:w="2040"/>
           </w:tcPr>
           <w:p>
             <w:r>
               <w:rPr>
-                <w:sz w:val="16"/>
+                <w:rFonts w:ascii="Times New Roman" w:hAnsi="Times New Roman"/>
+                <w:sz w:val="24"/>
               </w:rPr>
               <w:t>Klasifikasi Hasil Pertandingan Sepak Bola Menggunakan Algoritma XGBoost dan Random Forest Berdasarkan Statistik Babak Pertama</w:t>
             </w:r>
@@ -1071,38 +891,13 @@
         </w:tc>
         <w:tc>
           <w:tcPr>
-            <w:tcW w:type="dxa" w:w="1530"/>
+            <w:tcW w:type="dxa" w:w="2040"/>
           </w:tcPr>
           <w:p>
             <w:r>
               <w:rPr>
-                <w:sz w:val="16"/>
-              </w:rPr>
-              <w:t>https://scholar.google.com/scholar?q=Klasifikasi+Hasil+Pertandingan+Sepak+Bola+Menggunakan+Algoritma+XGBoost+dan+Random+Forest</w:t>
-            </w:r>
-          </w:p>
-        </w:tc>
-        <w:tc>
-          <w:tcPr>
-            <w:tcW w:type="dxa" w:w="1530"/>
-          </w:tcPr>
-          <w:p>
-            <w:r>
-              <w:rPr>
-                <w:sz w:val="16"/>
-              </w:rPr>
-              <w:t>Dataset Sepak Bola Eropa</w:t>
-            </w:r>
-          </w:p>
-        </w:tc>
-        <w:tc>
-          <w:tcPr>
-            <w:tcW w:type="dxa" w:w="1530"/>
-          </w:tcPr>
-          <w:p>
-            <w:r>
-              <w:rPr>
-                <w:sz w:val="16"/>
+                <w:rFonts w:ascii="Times New Roman" w:hAnsi="Times New Roman"/>
+                <w:sz w:val="24"/>
               </w:rPr>
               <w:t>XGBoost &amp; Random Forest</w:t>
             </w:r>
@@ -1110,12 +905,13 @@
         </w:tc>
         <w:tc>
           <w:tcPr>
-            <w:tcW w:type="dxa" w:w="1530"/>
+            <w:tcW w:type="dxa" w:w="2040"/>
           </w:tcPr>
           <w:p>
             <w:r>
               <w:rPr>
-                <w:sz w:val="16"/>
+                <w:rFonts w:ascii="Times New Roman" w:hAnsi="Times New Roman"/>
+                <w:sz w:val="24"/>
               </w:rPr>
               <w:t>Akurasi 65.90%</w:t>
             </w:r>
@@ -1123,12 +919,13 @@
         </w:tc>
         <w:tc>
           <w:tcPr>
-            <w:tcW w:type="dxa" w:w="1530"/>
+            <w:tcW w:type="dxa" w:w="2040"/>
           </w:tcPr>
           <w:p>
             <w:r>
               <w:rPr>
-                <w:sz w:val="16"/>
+                <w:rFonts w:ascii="Times New Roman" w:hAnsi="Times New Roman"/>
+                <w:sz w:val="24"/>
               </w:rPr>
               <w:t>Hanya menggunakan fitur statistik babak pertama tanpa mempertimbangkan kedisiplinan kartu dan sudut.</w:t>
             </w:r>
@@ -1138,12 +935,13 @@
       <w:tr>
         <w:tc>
           <w:tcPr>
-            <w:tcW w:type="dxa" w:w="1530"/>
+            <w:tcW w:type="dxa" w:w="2040"/>
           </w:tcPr>
           <w:p>
             <w:r>
               <w:rPr>
-                <w:sz w:val="16"/>
+                <w:rFonts w:ascii="Times New Roman" w:hAnsi="Times New Roman"/>
+                <w:sz w:val="24"/>
               </w:rPr>
               <w:t>10</w:t>
             </w:r>
@@ -1151,12 +949,13 @@
         </w:tc>
         <w:tc>
           <w:tcPr>
-            <w:tcW w:type="dxa" w:w="1530"/>
+            <w:tcW w:type="dxa" w:w="2040"/>
           </w:tcPr>
           <w:p>
             <w:r>
               <w:rPr>
-                <w:sz w:val="16"/>
+                <w:rFonts w:ascii="Times New Roman" w:hAnsi="Times New Roman"/>
+                <w:sz w:val="24"/>
               </w:rPr>
               <w:t>Fauzi &amp; Kurniawan (2021)</w:t>
             </w:r>
@@ -1164,12 +963,13 @@
         </w:tc>
         <w:tc>
           <w:tcPr>
-            <w:tcW w:type="dxa" w:w="1530"/>
+            <w:tcW w:type="dxa" w:w="2040"/>
           </w:tcPr>
           <w:p>
             <w:r>
               <w:rPr>
-                <w:sz w:val="16"/>
+                <w:rFonts w:ascii="Times New Roman" w:hAnsi="Times New Roman"/>
+                <w:sz w:val="24"/>
               </w:rPr>
               <w:t>Analisis Performa Algoritma Machine Learning Dalam Klasifikasi Data Tabular Sepak Bola</w:t>
             </w:r>
@@ -1177,38 +977,13 @@
         </w:tc>
         <w:tc>
           <w:tcPr>
-            <w:tcW w:type="dxa" w:w="1530"/>
+            <w:tcW w:type="dxa" w:w="2040"/>
           </w:tcPr>
           <w:p>
             <w:r>
               <w:rPr>
-                <w:sz w:val="16"/>
-              </w:rPr>
-              <w:t>https://www.researchgate.net/search.Search.html?query=Machine+Learning+Football+Match+Outcome</w:t>
-            </w:r>
-          </w:p>
-        </w:tc>
-        <w:tc>
-          <w:tcPr>
-            <w:tcW w:type="dxa" w:w="1530"/>
-          </w:tcPr>
-          <w:p>
-            <w:r>
-              <w:rPr>
-                <w:sz w:val="16"/>
-              </w:rPr>
-              <w:t>Kaggle European Football Dataset</w:t>
-            </w:r>
-          </w:p>
-        </w:tc>
-        <w:tc>
-          <w:tcPr>
-            <w:tcW w:type="dxa" w:w="1530"/>
-          </w:tcPr>
-          <w:p>
-            <w:r>
-              <w:rPr>
-                <w:sz w:val="16"/>
+                <w:rFonts w:ascii="Times New Roman" w:hAnsi="Times New Roman"/>
+                <w:sz w:val="24"/>
               </w:rPr>
               <w:t>KNN, Naive Bayes, Random Forest</w:t>
             </w:r>
@@ -1216,12 +991,13 @@
         </w:tc>
         <w:tc>
           <w:tcPr>
-            <w:tcW w:type="dxa" w:w="1530"/>
+            <w:tcW w:type="dxa" w:w="2040"/>
           </w:tcPr>
           <w:p>
             <w:r>
               <w:rPr>
-                <w:sz w:val="16"/>
+                <w:rFonts w:ascii="Times New Roman" w:hAnsi="Times New Roman"/>
+                <w:sz w:val="24"/>
               </w:rPr>
               <w:t>Akurasi Random Forest 63.70%</w:t>
             </w:r>
@@ -1229,12 +1005,13 @@
         </w:tc>
         <w:tc>
           <w:tcPr>
-            <w:tcW w:type="dxa" w:w="1530"/>
+            <w:tcW w:type="dxa" w:w="2040"/>
           </w:tcPr>
           <w:p>
             <w:r>
               <w:rPr>
-                <w:sz w:val="16"/>
+                <w:rFonts w:ascii="Times New Roman" w:hAnsi="Times New Roman"/>
+                <w:sz w:val="24"/>
               </w:rPr>
               <w:t>Belum ada integrasi teknik optimasi Bayesian pada model Random Forest.</w:t>
             </w:r>
@@ -1248,11 +1025,21 @@
         <w:pStyle w:val="Heading2"/>
       </w:pPr>
       <w:r>
+        <w:rPr>
+          <w:rFonts w:ascii="Times New Roman" w:hAnsi="Times New Roman"/>
+          <w:b/>
+          <w:color w:val="000000"/>
+          <w:sz w:val="24"/>
+        </w:rPr>
         <w:t>Kebaruan Penelitian (Novelty &amp; Research Gap)</w:t>
       </w:r>
     </w:p>
     <w:p>
       <w:r>
+        <w:rPr>
+          <w:rFonts w:ascii="Times New Roman" w:hAnsi="Times New Roman"/>
+          <w:sz w:val="24"/>
+        </w:rPr>
         <w:t>1. Penerapan Optimasi Bayesian (Optuna) mengatasi kelemahan Grid Search (Wijaya &amp; Susanto, 2023) dengan pencarian hyperparameter yang jauh lebih cepat dan akurat.</w:t>
         <w:br/>
         <w:t>2. Menggunakan Dataset Riil Terbaru Lima Liga Top Eropa Musim 2025/2026 (1.752 pertandingan).</w:t>
@@ -1633,6 +1420,10 @@
     <w:name w:val="Normal"/>
     <w:qFormat/>
     <w:rsid w:val="00FC693F"/>
+    <w:rPr>
+      <w:rFonts w:ascii="Times New Roman" w:hAnsi="Times New Roman"/>
+      <w:sz w:val="24"/>
+    </w:rPr>
   </w:style>
   <w:style w:type="paragraph" w:styleId="Header">
     <w:name w:val="header"/>

</xml_diff>